<commit_message>
Add analysis results and visualizations for ESG LLM qualitative analysis
- Created SVG figures for tone profiles, top terms, and word counts.
- Added CSV files for Jaccard similarity, TF-IDF cosine similarity, tone metrics, text metrics, and top terms.
- Included a structural audit report for the qualitative analysis document.
- Added a temporary file for the qualitative analysis document.
</commit_message>
<xml_diff>
--- a/reports/generated/Amazon_ESG_Report_Generated.docx
+++ b/reports/generated/Amazon_ESG_Report_Generated.docx
@@ -26,7 +26,7 @@
           <w:color w:val="555555"/>
           <w:sz w:val="22"/>
         </w:rPr>
-        <w:t>ESG Report 2025/2026 | DataNXT-relevante Antworten und Quellen-Audit</w:t>
+        <w:t>ESG Report 2025/2026 | DataNXT relevant answers and source audit</w:t>
       </w:r>
     </w:p>
     <w:p>
@@ -34,7 +34,7 @@
         <w:pStyle w:val="Heading1"/>
       </w:pPr>
       <w:r>
-        <w:t>Methodik und Datenbasis</w:t>
+        <w:t>Methodology and Data Basis</w:t>
       </w:r>
     </w:p>
     <w:p>
@@ -42,7 +42,7 @@
         <w:spacing w:after="120" w:line="264" w:lineRule="auto"/>
       </w:pPr>
       <w:r>
-        <w:t>Dieser Bericht konsolidiert die in DataNXT als relevant markierten Antworten mit dem lokalen Quellen-Audit im Projektordner. Offizielle Nachhaltigkeits-/Integrated Reports werden als Benchmark und Validierungsquelle verwendet; operative Annual Reports, Proxy-/AGM-Dokumente, Risk Reports, D&amp;I-/AI-/Data-Center-Dokumente und ausgewählte Unternehmensseiten bilden die Arbeitsgrundlage.</w:t>
+        <w:t>This report consolidates the answers marked as relevant in DataNXT with the local source audit in the project folder. Official sustainability and integrated reports are used as benchmark and validation sources; operational annual reports, proxy or AGM documents, risk reports, D&amp;I, AI, data-center documents and selected corporate pages form the working evidence base.</w:t>
       </w:r>
     </w:p>
     <w:p>
@@ -50,7 +50,7 @@
         <w:spacing w:after="120" w:line="264" w:lineRule="auto"/>
       </w:pPr>
       <w:r>
-        <w:t>Berichtsstand ist der 11. Juli 2026. Wo Kennzahlen aus 2024 stammen, wird dies im Text kenntlich gemacht; ansonsten beziehen sich die Aussagen auf 2025/2026 verfügbare Berichte.</w:t>
+        <w:t>The reporting cut-off is 11 July 2026. Where figures refer to 2024, this is stated in the text; otherwise the report reflects 2025/2026 documents available during the workflow.</w:t>
       </w:r>
     </w:p>
     <w:p>
@@ -58,7 +58,7 @@
         <w:pStyle w:val="Heading2"/>
       </w:pPr>
       <w:r>
-        <w:t>DataNXT-Status</w:t>
+        <w:t>DataNXT Status</w:t>
       </w:r>
     </w:p>
     <w:p>
@@ -67,7 +67,7 @@
         <w:spacing w:after="120" w:line="280" w:lineRule="auto"/>
       </w:pPr>
       <w:r>
-        <w:t>General Information: relevante Antwort aus Amazon Annual Report 2025.</w:t>
+        <w:t>General Information: relevant answer based on Amazon Annual Report 2025.</w:t>
       </w:r>
     </w:p>
     <w:p>
@@ -76,7 +76,7 @@
         <w:spacing w:after="120" w:line="280" w:lineRule="auto"/>
       </w:pPr>
       <w:r>
-        <w:t>Environmental: relevante Antwort mit Amazon Data Centers/AWS-Effizienz, Wasser- und Energiepunkten.</w:t>
+        <w:t>Environmental: relevant answer covering Amazon Data Centers, AWS efficiency, water, energy and circularity topics.</w:t>
       </w:r>
     </w:p>
     <w:p>
@@ -85,7 +85,7 @@
         <w:spacing w:after="120" w:line="280" w:lineRule="auto"/>
       </w:pPr>
       <w:r>
-        <w:t>Social: relevante Antwort mit Amazon Racial Equity Audit und Mitarbeiter-/DEI-Informationen.</w:t>
+        <w:t>Social: relevant answer based on the Amazon Racial Equity Audit and workforce/DEI information.</w:t>
       </w:r>
     </w:p>
     <w:p>
@@ -94,7 +94,7 @@
         <w:spacing w:after="120" w:line="280" w:lineRule="auto"/>
       </w:pPr>
       <w:r>
-        <w:t>Governance: relevante Antwort mit Annual Report 2025 und Proxy Statement 2026.</w:t>
+        <w:t>Governance: relevant answer based on the Annual Report 2025 and Proxy Statement 2026.</w:t>
       </w:r>
     </w:p>
     <w:p>
@@ -110,7 +110,7 @@
         <w:spacing w:after="120" w:line="264" w:lineRule="auto"/>
       </w:pPr>
       <w:r>
-        <w:t>Amazon ist aus ESG-Sicht ein hoch skalierter Plattform-, Handels-, Cloud- und Logistikkonzern. Die ESG-Exposition ist entsprechend zweigeteilt: Einerseits verfügt Amazon über erhebliche Ressourcen, um Effizienz, erneuerbare Energien, Elektroflotten, Wasserprogramme und Supply-Chain-Standards voranzutreiben. Andererseits entstehen durch AWS-Wachstum, KI-Rechenzentren, globale Logistik, Marktplatz- und Lieferkettenkomplexität sowie arbeitsbezogene Kontroversen substantielle ökologische, soziale und Governance-Risiken.</w:t>
+        <w:t>Amazon is a highly scaled platform, retail, cloud and logistics company. Its ESG exposure is therefore unusually broad: the company has the resources to drive renewable energy, electric delivery, water-positive projects, efficiency and supply-chain standards, but the same scale creates material risks around AWS and AI data centers, global logistics, marketplace complexity, labor practices and governance of emerging technologies.</w:t>
       </w:r>
     </w:p>
     <w:p>
@@ -118,7 +118,7 @@
         <w:pStyle w:val="Heading1"/>
       </w:pPr>
       <w:r>
-        <w:t>Kernkennzahlen und ESG-Signale</w:t>
+        <w:t>Key Metrics and ESG Signals</w:t>
       </w:r>
     </w:p>
     <w:tbl>
@@ -146,7 +146,7 @@
               <w:rPr>
                 <w:b/>
               </w:rPr>
-              <w:t>Kategorie</w:t>
+              <w:t>Category</w:t>
             </w:r>
           </w:p>
         </w:tc>
@@ -161,7 +161,7 @@
               <w:rPr>
                 <w:b/>
               </w:rPr>
-              <w:t>Kernaussage / Kennzahl</w:t>
+              <w:t>Key statement / metric</w:t>
             </w:r>
           </w:p>
         </w:tc>
@@ -174,7 +174,7 @@
           </w:tcPr>
           <w:p>
             <w:r>
-              <w:t>Umsatz / Segmente</w:t>
+              <w:t>Revenue / segments</w:t>
             </w:r>
           </w:p>
         </w:tc>
@@ -185,7 +185,7 @@
           </w:tcPr>
           <w:p>
             <w:r>
-              <w:t>2025: USD 717 Mrd.; North America USD 426 Mrd., International USD 162 Mrd., AWS USD 129 Mrd.</w:t>
+              <w:t>2025 revenue of USD 717 billion; North America USD 426 billion, International USD 162 billion and AWS USD 129 billion.</w:t>
             </w:r>
           </w:p>
         </w:tc>
@@ -198,7 +198,7 @@
           </w:tcPr>
           <w:p>
             <w:r>
-              <w:t>Beschäftigte</w:t>
+              <w:t>Workforce</w:t>
             </w:r>
           </w:p>
         </w:tc>
@@ -209,7 +209,7 @@
           </w:tcPr>
           <w:p>
             <w:r>
-              <w:t>ca. 1,525 Mio. Mitarbeitende weltweit; US-Belegschaft in niedrigeren Leveln besonders divers.</w:t>
+              <w:t>Approximately 1.525 million employees worldwide; the US workforce is especially diverse in lower job levels.</w:t>
             </w:r>
           </w:p>
         </w:tc>
@@ -222,7 +222,7 @@
           </w:tcPr>
           <w:p>
             <w:r>
-              <w:t>Klimarahmen</w:t>
+              <w:t>Climate framework</w:t>
             </w:r>
           </w:p>
         </w:tc>
@@ -233,7 +233,7 @@
           </w:tcPr>
           <w:p>
             <w:r>
-              <w:t>The Climate Pledge: Netto-Null bis 2040; 100% Stromverbrauch rechnerisch mit erneuerbaren Energien gematcht.</w:t>
+              <w:t>The Climate Pledge: net zero carbon by 2040; electricity consumption matched with renewable energy.</w:t>
             </w:r>
           </w:p>
         </w:tc>
@@ -246,7 +246,7 @@
           </w:tcPr>
           <w:p>
             <w:r>
-              <w:t>Emissionen</w:t>
+              <w:t>Emissions</w:t>
             </w:r>
           </w:p>
         </w:tc>
@@ -257,7 +257,7 @@
           </w:tcPr>
           <w:p>
             <w:r>
-              <w:t>2025 Sustainability Report: ca. 80,85 Mio. t CO2e berichtete Treibhausgasemissionen.</w:t>
+              <w:t>The 2025 Sustainability Report reports approximately 80.85 million metric tons CO2e.</w:t>
             </w:r>
           </w:p>
         </w:tc>
@@ -270,7 +270,7 @@
           </w:tcPr>
           <w:p>
             <w:r>
-              <w:t>AWS-Infrastruktur</w:t>
+              <w:t>AWS infrastructure</w:t>
             </w:r>
           </w:p>
         </w:tc>
@@ -281,7 +281,7 @@
           </w:tcPr>
           <w:p>
             <w:r>
-              <w:t>AWS berichtete 2024 einen PUE von 1,15; Graviton kann je nach Workload bis zu 60% weniger Energie verbrauchen.</w:t>
+              <w:t>AWS reported a 2024 PUE of 1.15; Graviton can reduce energy use by up to 60% for selected workloads.</w:t>
             </w:r>
           </w:p>
         </w:tc>
@@ -305,7 +305,7 @@
           </w:tcPr>
           <w:p>
             <w:r>
-              <w:t>Board mit Executive Chair Jeff Bezos, CEO Andy Jassy und spezialisierten Audit-, Governance-/Nominierungs-, Leadership- und Security-Ausschüssen.</w:t>
+              <w:t>Board led by Executive Chair Jeff Bezos and CEO Andy Jassy, with audit, governance, compensation and security committees.</w:t>
             </w:r>
           </w:p>
         </w:tc>
@@ -324,7 +324,7 @@
         <w:spacing w:after="120" w:line="264" w:lineRule="auto"/>
       </w:pPr>
       <w:r>
-        <w:t>Amazon verfolgt weiterhin den Anspruch, das kundenorientierteste Unternehmen der Welt zu sein. Die operative Struktur umfasst North America, International und AWS. Die Kunden- und Stakeholdergruppen reichen von Konsumenten und Marketplace-Sellern über Entwickler, Unternehmen und Werbekunden bis zu Content Creators und Mitarbeitenden.</w:t>
+        <w:t>Amazon continues to pursue the ambition of being Earth's most customer-centric company. Its operating structure is organized around North America, International and AWS. The main stakeholder groups include consumers, sellers, developers, enterprises, advertisers, content creators and employees.</w:t>
       </w:r>
     </w:p>
     <w:p>
@@ -332,7 +332,7 @@
         <w:spacing w:after="120" w:line="264" w:lineRule="auto"/>
       </w:pPr>
       <w:r>
-        <w:t>2025 war durch starkes Umsatzwachstum, beschleunigte KI-Investitionen und hohe Capex-Dynamik geprägt. Der Jahresumsatz stieg auf USD 717 Mrd.; AWS wuchs auf USD 129 Mrd. und ist zentraler Hebel für Profitabilität, Innovation und ESG-Risiken der Infrastruktur.</w:t>
+        <w:t>2025 was marked by strong revenue growth, accelerating AI investment and major capital expenditure. Revenue rose to USD 717 billion, while AWS reached USD 129 billion and remains both a profitability engine and a key source of infrastructure-related ESG exposure.</w:t>
       </w:r>
     </w:p>
     <w:p>
@@ -340,7 +340,7 @@
         <w:spacing w:after="120" w:line="264" w:lineRule="auto"/>
       </w:pPr>
       <w:r>
-        <w:t>Die Strategie ist langfristig und kapitalintensiv: Amazon investiert in Fulfillment-Automatisierung, Same-Day- und ländliche Liefernetze, Satellitenkonnektivität, generative KI, eigene Chips sowie neue Kundenerlebnisse. ESG-relevant ist dabei, ob diese Skalierung mit sinkenden Umweltintensitäten, guter Arbeitssicherheit und kontrollierten Risiken einhergeht.</w:t>
+        <w:t>Amazon's strategy is long-term and capital intensive. The company is investing in fulfillment automation, same-day and rural delivery, satellite connectivity, generative AI, proprietary chips and new customer experiences. The ESG question is whether this scale-up can be paired with lower environmental intensity, strong worker safety and controlled technology risk.</w:t>
       </w:r>
     </w:p>
     <w:p>
@@ -356,7 +356,7 @@
         <w:spacing w:after="120" w:line="264" w:lineRule="auto"/>
       </w:pPr>
       <w:r>
-        <w:t>Amazon hat mit The Climate Pledge ein Netto-Null-Ziel bis 2040 gesetzt. Das Unternehmen berichtet, seinen Stromverbrauch rechnerisch vollständig mit erneuerbaren Energien zu matchen. Der absolute Emissionsfußabdruck bleibt wegen Handelsvolumen, Logistik, Gebäuden, Rechenzentren und Scope-3-Anteilen jedoch sehr hoch.</w:t>
+        <w:t>Amazon has committed to net zero carbon by 2040 through The Climate Pledge. It reports that electricity consumption is matched with renewable energy, although absolute emissions remain very large because of retail volume, logistics, buildings, data centers and Scope 3 categories.</w:t>
       </w:r>
     </w:p>
     <w:p>
@@ -364,7 +364,7 @@
         <w:spacing w:after="120" w:line="264" w:lineRule="auto"/>
       </w:pPr>
       <w:r>
-        <w:t>AWS ist ein ESG-Schwerpunkt: Data-Center-Designs, Liquid-to-Chip-Kühlung, eigene Siliziumchips, Graviton-Instanzen und Server-Lifecycle-Management sollen Energieeffizienz verbessern. DataNXT hob AWS PUE 1,15 für 2024 sowie Effizienzgewinne durch Graviton und neue Rechenzentrumsarchitekturen hervor.</w:t>
+        <w:t>AWS is a central environmental topic. Data-center design, liquid-to-chip cooling, proprietary silicon, Graviton instances and server lifecycle management are intended to improve energy efficiency. DataNXT highlighted AWS PUE of 1.15 in 2024 and efficiency gains from Graviton and new data-center architectures.</w:t>
       </w:r>
     </w:p>
     <w:p>
@@ -372,7 +372,7 @@
         <w:spacing w:after="120" w:line="264" w:lineRule="auto"/>
       </w:pPr>
       <w:r>
-        <w:t>Wasser ist ein materielles Thema für Rechenzentren. Amazon verfolgt ein Water-Positive-Ziel bis 2030; der Sustainability Report berichtet Fortschritte und Replenishment-Projekte. Für den Bericht bleibt wichtig, regionale Wasserstressgebiete, AI-Lastprofile und Kühltechnologien künftig granularer zu prüfen.</w:t>
+        <w:t>Water is material for data centers. Amazon pursues a water-positive target by 2030 and reports progress through replenishment projects. Future ESG monitoring should pay particular attention to regional water-stress exposure, AI workload growth and cooling technology choices.</w:t>
       </w:r>
     </w:p>
     <w:p>
@@ -380,7 +380,7 @@
         <w:spacing w:after="120" w:line="264" w:lineRule="auto"/>
       </w:pPr>
       <w:r>
-        <w:t>Logistik und Verpackung bleiben relevante Hebel. Elektrische Lieferfahrzeuge, Routenoptimierung, Konsolidierung, Verpackungsreduktion und Kreislaufprogramme reduzieren Intensitäten, können das absolute Wachstum aber nur teilweise kompensieren.</w:t>
+        <w:t>Logistics and packaging remain important levers. Electric delivery vans, route optimization, packaging reduction and circularity programs can reduce intensity, but they only partly offset absolute growth in commerce and delivery volumes.</w:t>
       </w:r>
     </w:p>
     <w:p>
@@ -396,7 +396,7 @@
         <w:spacing w:after="120" w:line="264" w:lineRule="auto"/>
       </w:pPr>
       <w:r>
-        <w:t>Amazon ist mit rund 1,525 Mio. Mitarbeitenden einer der größten Arbeitgeber weltweit. Damit sind Arbeitsbedingungen, Arbeitssicherheit, Schichtsysteme, Karrierepfade, Vergütung, Beschwerdemechanismen und Diversity-Kennzahlen besonders wesentlich.</w:t>
+        <w:t>With roughly 1.525 million employees, Amazon is one of the world's largest private employers. Working conditions, occupational safety, scheduling, promotion pathways, pay, grievance mechanisms and diversity metrics are therefore highly material.</w:t>
       </w:r>
     </w:p>
     <w:p>
@@ -404,7 +404,7 @@
         <w:spacing w:after="120" w:line="264" w:lineRule="auto"/>
       </w:pPr>
       <w:r>
-        <w:t>Die relevante DataNXT-Antwort zum Racial Equity Audit verweist auf eine US-Belegschaft mit mehr als 69% rassisch/ethnisch diversen Mitarbeitenden und über 78% in den Leveln L1/L3. Amazon unterhält 13 Affinity Groups und beschreibt Mechanismen für Feedback, Beschwerden und Appeals.</w:t>
+        <w:t>The DataNXT answer based on the Racial Equity Audit noted that more than 69% of the US workforce is racially or ethnically diverse, with more than 78% diversity in levels L1/L3. Amazon also reports 13 affinity groups and channels for feedback, complaints and appeals.</w:t>
       </w:r>
     </w:p>
     <w:p>
@@ -412,7 +412,7 @@
         <w:spacing w:after="120" w:line="264" w:lineRule="auto"/>
       </w:pPr>
       <w:r>
-        <w:t>Soziale ESG-Risiken bestehen in hoher operativer Taktung, potenziellen Disziplinar- und Beförderungsungleichheiten, Arbeitssicherheitsrisiken in Fulfillment und Delivery sowie in Lieferketten- und Menschenrechtsthemen. Die DataNXT-Quellen zeigen vorhandene Prozesse, aber auch Prüfbedarf hinsichtlich Wirksamkeit und Ergebniskennzahlen.</w:t>
+        <w:t>Social risks include operational intensity, potential disparities in discipline and promotion outcomes, fulfillment and delivery safety, labor relations, supply-chain labor conditions and human-rights due diligence. Existing mechanisms are visible, but the effectiveness of outcomes remains an important monitoring area.</w:t>
       </w:r>
     </w:p>
     <w:p>
@@ -428,7 +428,7 @@
         <w:spacing w:after="120" w:line="264" w:lineRule="auto"/>
       </w:pPr>
       <w:r>
-        <w:t>Amazon verfügt über ein Board mit Executive Chair Jeff Bezos und CEO Andy Jassy sowie unabhängigen Directors mit Technologie-, Risiko-, Finanz- und Governance-Erfahrung. Die Ausschüsse decken Audit, Leadership Development and Compensation, Nominating/Corporate Governance und Security ab.</w:t>
+        <w:t>Amazon's board includes Executive Chair Jeff Bezos, CEO Andy Jassy and independent directors with technology, risk, finance and governance experience. The committee structure covers audit, leadership development and compensation, nominating/corporate governance and security.</w:t>
       </w:r>
     </w:p>
     <w:p>
@@ -436,7 +436,7 @@
         <w:spacing w:after="120" w:line="264" w:lineRule="auto"/>
       </w:pPr>
       <w:r>
-        <w:t>Die Governance-Antwort aus DataNXT betonte Aufsicht über Nachhaltigkeit, Corporate Social Responsibility, verantwortliche KI, Cybersecurity und Risikomanagement. In einem KI- und Cloud-Skalierungszyklus ist diese Aufsicht besonders relevant, weil Investitionen, Energiebedarf, Sicherheit und gesellschaftliche Risiken gleichzeitig steigen.</w:t>
+        <w:t>DataNXT emphasized board oversight of sustainability, corporate social responsibility, responsible AI, cybersecurity and enterprise risk. This oversight is especially relevant in a cycle of AI and cloud expansion where capital allocation, energy demand, security and societal risk rise at the same time.</w:t>
       </w:r>
     </w:p>
     <w:p>
@@ -444,7 +444,7 @@
         <w:spacing w:after="120" w:line="264" w:lineRule="auto"/>
       </w:pPr>
       <w:r>
-        <w:t>Die Proxy-Unterlagen zeigen eine langfristige, aktienbasierte Vergütungslogik und geringe Barboni bei Named Executive Officers. Für ESG bleibt wesentlich, ob Vergütung, Board-Agenda und Berichterstattung ausreichend an Klimazielen, Sicherheit, Responsible AI und Menschenrechtsrisiken ausgerichtet sind.</w:t>
+        <w:t>The proxy materials show a long-term, equity-oriented compensation philosophy and limited cash bonuses for named executive officers. From an ESG perspective, the next question is how clearly executive incentives, board agenda items and disclosures are linked to climate, safety, responsible AI and human-rights outcomes.</w:t>
       </w:r>
     </w:p>
     <w:p>
@@ -452,7 +452,7 @@
         <w:pStyle w:val="Heading1"/>
       </w:pPr>
       <w:r>
-        <w:t>ESG-Risiken, Datenlücken und Prioritäten</w:t>
+        <w:t>ESG Risks, Data Gaps and Priorities</w:t>
       </w:r>
     </w:p>
     <w:p>
@@ -461,7 +461,7 @@
         <w:spacing w:after="120" w:line="280" w:lineRule="auto"/>
       </w:pPr>
       <w:r>
-        <w:t>Absolute Emissionen und Energiebedarf können trotz Effizienzmaßnahmen steigen, besonders durch KI- und Cloud-Nachfrage.</w:t>
+        <w:t>Absolute emissions and energy demand may continue to rise despite efficiency improvements, particularly because of AI and cloud demand.</w:t>
       </w:r>
     </w:p>
     <w:p>
@@ -470,7 +470,7 @@
         <w:spacing w:after="120" w:line="280" w:lineRule="auto"/>
       </w:pPr>
       <w:r>
-        <w:t>Arbeits- und Lieferkettenkontroversen können Reputation und Regulierung beeinflussen.</w:t>
+        <w:t>Labor and supply-chain controversies may create reputational, legal and regulatory exposure.</w:t>
       </w:r>
     </w:p>
     <w:p>
@@ -479,7 +479,7 @@
         <w:spacing w:after="120" w:line="280" w:lineRule="auto"/>
       </w:pPr>
       <w:r>
-        <w:t>Responsible-AI-, Datenschutz- und Cybersecurity-Risiken steigen durch Skalierung von AWS und Consumer-AI-Anwendungen.</w:t>
+        <w:t>Responsible AI, privacy and cybersecurity risks increase as AWS and consumer AI applications scale.</w:t>
       </w:r>
     </w:p>
     <w:p>
@@ -488,7 +488,7 @@
         <w:spacing w:after="120" w:line="280" w:lineRule="auto"/>
       </w:pPr>
       <w:r>
-        <w:t>Datenlücken betreffen vor allem regionale Wasserwirkungen, Scope-3-Zuordnung, Lieferkettenwirksamkeit und externe Prüfung der Sozialkennzahlen.</w:t>
+        <w:t>Data gaps remain around regional water impact, Scope 3 attribution, supplier-performance outcomes and externally assured social indicators.</w:t>
       </w:r>
     </w:p>
     <w:p>
@@ -496,7 +496,7 @@
         <w:pStyle w:val="Heading1"/>
       </w:pPr>
       <w:r>
-        <w:t>Priorisierte Monitoring-Fragen</w:t>
+        <w:t>Prioritized Monitoring Questions</w:t>
       </w:r>
     </w:p>
     <w:p>
@@ -505,7 +505,7 @@
         <w:spacing w:after="120" w:line="280" w:lineRule="auto"/>
       </w:pPr>
       <w:r>
-        <w:t>Welche ESG-Kennzahlen sind im nächsten Berichtszyklus extern geprüft, und wo beruhen Aussagen noch auf Managementangaben oder modellierten Annahmen?</w:t>
+        <w:t>Which ESG metrics are externally assured in the next reporting cycle, and which statements still rely on management assertions or modeled assumptions?</w:t>
       </w:r>
     </w:p>
     <w:p>
@@ -514,7 +514,7 @@
         <w:spacing w:after="120" w:line="280" w:lineRule="auto"/>
       </w:pPr>
       <w:r>
-        <w:t>Wie entwickeln sich absolute Emissionen, Energiebedarf, Wasserwirkung und Scope-3-Kategorien im Verhältnis zu Umsatz-, Cloud-, Plattform- oder Logistikwachstum?</w:t>
+        <w:t>How do absolute emissions, energy demand, water impact and Scope 3 categories develop relative to revenue, cloud, platform or logistics growth?</w:t>
       </w:r>
     </w:p>
     <w:p>
@@ -523,7 +523,7 @@
         <w:spacing w:after="120" w:line="280" w:lineRule="auto"/>
       </w:pPr>
       <w:r>
-        <w:t>Welche ESG-Ziele sind mit Vorstands-/Managementvergütung, Investitionsentscheidungen, Lieferantensteuerung und Produktentwicklung verknüpft?</w:t>
+        <w:t>Which ESG targets are linked to executive compensation, capital allocation, supplier management and product development?</w:t>
       </w:r>
     </w:p>
     <w:p>
@@ -532,7 +532,7 @@
         <w:spacing w:after="120" w:line="280" w:lineRule="auto"/>
       </w:pPr>
       <w:r>
-        <w:t>Welche Beschwerden, Audits, Incidents oder Stakeholder-Feedbacks zeigen tatsächliche Wirkung der Social- und Governance-Programme statt nur Prozessabdeckung?</w:t>
+        <w:t>Which complaints, audits, incidents or stakeholder feedback show the real effectiveness of social and governance programs rather than only process coverage?</w:t>
       </w:r>
     </w:p>
     <w:p>
@@ -541,7 +541,7 @@
         <w:spacing w:after="120" w:line="280" w:lineRule="auto"/>
       </w:pPr>
       <w:r>
-        <w:t>Welche DataNXT-Antworten sollten im nächsten Schritt mit zusätzlichen Primärdokumenten vertieft werden, etwa Audit Reports, Assurance Statements, regionalen Umweltkennzahlen oder Supplier-Listen?</w:t>
+        <w:t>Which DataNXT answers should be deepened with additional primary documents, such as assurance statements, regional environmental metrics, supplier lists or audit reports?</w:t>
       </w:r>
     </w:p>
     <w:p>
@@ -549,7 +549,7 @@
         <w:pStyle w:val="Heading1"/>
       </w:pPr>
       <w:r>
-        <w:t>Quellenanhang</w:t>
+        <w:t>Source Appendix</w:t>
       </w:r>
     </w:p>
     <w:p>
@@ -557,7 +557,7 @@
         <w:spacing w:after="80"/>
       </w:pPr>
       <w:r>
-        <w:t>Die Tabelle nennt die wichtigsten Quellen, die im DataNXT-Workflow und im lokalen Quellen-Audit verwendet wurden.</w:t>
+        <w:t>The table lists the most important sources used in the DataNXT workflow and in the local source audit.</w:t>
       </w:r>
     </w:p>
     <w:tbl>
@@ -582,7 +582,7 @@
           </w:tcPr>
           <w:p>
             <w:r>
-              <w:t>Quelle</w:t>
+              <w:t>Source</w:t>
             </w:r>
           </w:p>
         </w:tc>
@@ -594,7 +594,7 @@
           </w:tcPr>
           <w:p>
             <w:r>
-              <w:t>Verwendung</w:t>
+              <w:t>Use</w:t>
             </w:r>
           </w:p>
         </w:tc>
@@ -618,7 +618,7 @@
           </w:tcPr>
           <w:p>
             <w:r>
-              <w:t>Lokal: data/amazon/Amazon-2025-Annual-Report.pdf; Umsatz, Segmente, Strategie, Board.</w:t>
+              <w:t>Local: data/amazon/Amazon-2025-Annual-Report.pdf; revenue, segments, strategy and board information.</w:t>
             </w:r>
           </w:p>
         </w:tc>
@@ -714,7 +714,7 @@
           </w:tcPr>
           <w:p>
             <w:r>
-              <w:t>Lokal: data/amazon/Amazon.com, Inc. - Amazon-2026-Proxy-Statement.pdf</w:t>
+              <w:t>Local: data/amazon/Amazon.com, Inc. - Amazon-2026-Proxy-Statement.pdf</w:t>
             </w:r>
           </w:p>
         </w:tc>

</xml_diff>